<commit_message>
Add Future of Egypt role, end Vision22 in June 2026, fix CV portfolio link
Co-Authored-By: Claude Opus 5.5 <noreply@anthropic.com>
Claude-Session: https://claude.ai/code/session_0179DEjyD3wPg587fQnHCEuc
</commit_message>
<xml_diff>
--- a/Mohamed Mohsen ( Web Developer ).docx
+++ b/Mohamed Mohsen ( Web Developer ).docx
@@ -291,7 +291,7 @@
           <w:sz w:val="28"/>
           <w:szCs w:val="28"/>
         </w:rPr>
-        <w:t>Remote Web Developer</w:t>
+        <w:t>Full Stack Developer</w:t>
       </w:r>
       <w:r>
         <w:rPr>
@@ -300,23 +300,7 @@
           <w:szCs w:val="28"/>
         </w:rPr>
         <w:br/>
-        <w:t>Auto Media Marketing Agency | Giza, Egypt | Oct 202</w:t>
-      </w:r>
-      <w:r>
-        <w:rPr>
-          <w:rFonts w:ascii="Calibri" w:eastAsia="Times New Roman" w:hAnsi="Calibri" w:cs="Calibri"/>
-          <w:sz w:val="28"/>
-          <w:szCs w:val="28"/>
-        </w:rPr>
-        <w:t>4</w:t>
-      </w:r>
-      <w:r>
-        <w:rPr>
-          <w:rFonts w:ascii="Calibri" w:eastAsia="Times New Roman" w:hAnsi="Calibri" w:cs="Calibri"/>
-          <w:sz w:val="28"/>
-          <w:szCs w:val="28"/>
-        </w:rPr>
-        <w:t xml:space="preserve"> – Present</w:t>
+        <w:t>Future of Egypt for Sustainable Development | Cairo, Egypt | Oct 2026 – Present</w:t>
       </w:r>
     </w:p>
     <w:p>
@@ -346,24 +330,19 @@
           <w:sz w:val="28"/>
           <w:szCs w:val="28"/>
         </w:rPr>
-        <w:t xml:space="preserve">1 - </w:t>
-      </w:r>
-      <w:r>
-        <w:rPr>
-          <w:rFonts w:cstheme="minorHAnsi"/>
-          <w:sz w:val="28"/>
-          <w:szCs w:val="28"/>
-        </w:rPr>
-        <w:t>Designed and developed user-friendly, responsive web solutions tailored to client needs using WordPress</w:t>
-      </w:r>
-      <w:r>
+        <w:t>1 - Develop and maintain full-stack web applications and internal systems, covering front-end interfaces, back-end logic, and databases.</w:t>
+      </w:r>
+    </w:p>
+    <w:p>
+      <w:pPr>
+        <w:pStyle w:val="ListParagraph"/>
+        <w:spacing w:before="100" w:beforeAutospacing="1" w:after="100" w:afterAutospacing="1" w:line="276" w:lineRule="auto"/>
         <w:rPr>
           <w:rFonts w:eastAsia="Times New Roman" w:cstheme="minorHAnsi"/>
           <w:sz w:val="28"/>
           <w:szCs w:val="28"/>
         </w:rPr>
-        <w:t>.</w:t>
-      </w:r>
+      </w:pPr>
     </w:p>
     <w:p>
       <w:pPr>
@@ -375,60 +354,44 @@
           <w:szCs w:val="28"/>
         </w:rPr>
       </w:pPr>
-    </w:p>
-    <w:p>
-      <w:pPr>
-        <w:pStyle w:val="ListParagraph"/>
-        <w:spacing w:before="100" w:beforeAutospacing="1" w:after="100" w:afterAutospacing="1" w:line="276" w:lineRule="auto"/>
+      <w:r>
         <w:rPr>
           <w:rFonts w:eastAsia="Times New Roman" w:cstheme="minorHAnsi"/>
           <w:sz w:val="28"/>
           <w:szCs w:val="28"/>
         </w:rPr>
-      </w:pPr>
-      <w:r>
+        <w:t>2 - Build responsive, user-friendly interfaces and integrate them with RESTful APIs and back-end services.</w:t>
+      </w:r>
+    </w:p>
+    <w:p>
+      <w:pPr>
+        <w:pStyle w:val="ListParagraph"/>
+        <w:spacing w:before="100" w:beforeAutospacing="1" w:after="100" w:afterAutospacing="1" w:line="276" w:lineRule="auto"/>
         <w:rPr>
           <w:rFonts w:eastAsia="Times New Roman" w:cstheme="minorHAnsi"/>
           <w:sz w:val="28"/>
           <w:szCs w:val="28"/>
         </w:rPr>
-        <w:t xml:space="preserve">2 - </w:t>
-      </w:r>
-      <w:r>
-        <w:rPr>
-          <w:rFonts w:cstheme="minorHAnsi"/>
-          <w:sz w:val="28"/>
-          <w:szCs w:val="28"/>
-        </w:rPr>
-        <w:t>Implemented new features and plugins to enhance functionality across multiple website</w:t>
-      </w:r>
-      <w:r>
-        <w:rPr>
-          <w:rFonts w:cstheme="minorHAnsi"/>
-          <w:sz w:val="28"/>
-          <w:szCs w:val="28"/>
-        </w:rPr>
-        <w:t>s</w:t>
-      </w:r>
-      <w:r>
+      </w:pPr>
+    </w:p>
+    <w:p>
+      <w:pPr>
+        <w:pStyle w:val="ListParagraph"/>
+        <w:spacing w:before="100" w:beforeAutospacing="1" w:after="100" w:afterAutospacing="1" w:line="276" w:lineRule="auto"/>
         <w:rPr>
           <w:rFonts w:eastAsia="Times New Roman" w:cstheme="minorHAnsi"/>
           <w:sz w:val="28"/>
           <w:szCs w:val="28"/>
         </w:rPr>
-        <w:t>.</w:t>
-      </w:r>
-    </w:p>
-    <w:p>
-      <w:pPr>
-        <w:pStyle w:val="ListParagraph"/>
-        <w:spacing w:before="100" w:beforeAutospacing="1" w:after="100" w:afterAutospacing="1" w:line="276" w:lineRule="auto"/>
+      </w:pPr>
+      <w:r>
         <w:rPr>
           <w:rFonts w:eastAsia="Times New Roman" w:cstheme="minorHAnsi"/>
           <w:sz w:val="28"/>
           <w:szCs w:val="28"/>
         </w:rPr>
-      </w:pPr>
+        <w:t>3 - Work with cross-functional teams to turn business requirements into reliable features delivered on schedule.</w:t>
+      </w:r>
     </w:p>
     <w:p>
       <w:pPr>
@@ -440,76 +403,25 @@
           <w:szCs w:val="28"/>
         </w:rPr>
       </w:pPr>
-      <w:r>
+    </w:p>
+    <w:p>
+      <w:pPr>
+        <w:pStyle w:val="ListParagraph"/>
+        <w:spacing w:before="100" w:beforeAutospacing="1" w:after="100" w:afterAutospacing="1" w:line="276" w:lineRule="auto"/>
         <w:rPr>
           <w:rFonts w:eastAsia="Times New Roman" w:cstheme="minorHAnsi"/>
           <w:sz w:val="28"/>
           <w:szCs w:val="28"/>
-        </w:rPr>
-        <w:t xml:space="preserve">3 - </w:t>
-      </w:r>
-      <w:r>
-        <w:rPr>
-          <w:rFonts w:cstheme="minorHAnsi"/>
-          <w:sz w:val="28"/>
-          <w:szCs w:val="28"/>
-        </w:rPr>
-        <w:t>Optimized websites for SEO, resulting in improved rankings and visibility</w:t>
-      </w:r>
+          <w:rtl/>
+        </w:rPr>
+      </w:pPr>
       <w:r>
         <w:rPr>
           <w:rFonts w:eastAsia="Times New Roman" w:cstheme="minorHAnsi"/>
           <w:sz w:val="28"/>
           <w:szCs w:val="28"/>
         </w:rPr>
-        <w:t>.</w:t>
-      </w:r>
-    </w:p>
-    <w:p>
-      <w:pPr>
-        <w:pStyle w:val="ListParagraph"/>
-        <w:spacing w:before="100" w:beforeAutospacing="1" w:after="100" w:afterAutospacing="1" w:line="276" w:lineRule="auto"/>
-        <w:rPr>
-          <w:rFonts w:eastAsia="Times New Roman" w:cstheme="minorHAnsi"/>
-          <w:sz w:val="28"/>
-          <w:szCs w:val="28"/>
-        </w:rPr>
-      </w:pPr>
-    </w:p>
-    <w:p>
-      <w:pPr>
-        <w:pStyle w:val="ListParagraph"/>
-        <w:spacing w:before="100" w:beforeAutospacing="1" w:after="100" w:afterAutospacing="1" w:line="276" w:lineRule="auto"/>
-        <w:rPr>
-          <w:rFonts w:eastAsia="Times New Roman" w:cstheme="minorHAnsi"/>
-          <w:sz w:val="28"/>
-          <w:szCs w:val="28"/>
-          <w:rtl/>
-        </w:rPr>
-      </w:pPr>
-      <w:r>
-        <w:rPr>
-          <w:rFonts w:eastAsia="Times New Roman" w:cstheme="minorHAnsi"/>
-          <w:sz w:val="28"/>
-          <w:szCs w:val="28"/>
-        </w:rPr>
-        <w:t xml:space="preserve">4 - </w:t>
-      </w:r>
-      <w:r>
-        <w:rPr>
-          <w:rFonts w:cstheme="minorHAnsi"/>
-          <w:sz w:val="28"/>
-          <w:szCs w:val="28"/>
-        </w:rPr>
-        <w:t>Analyzed website performance metrics and applied improvements for speed and reliability</w:t>
-      </w:r>
-      <w:r>
-        <w:rPr>
-          <w:rFonts w:eastAsia="Times New Roman" w:cstheme="minorHAnsi"/>
-          <w:sz w:val="28"/>
-          <w:szCs w:val="28"/>
-        </w:rPr>
-        <w:t>.</w:t>
+        <w:t>4 - Improve performance, security, and code quality through testing, debugging, and code reviews.</w:t>
       </w:r>
     </w:p>
     <w:p>
@@ -545,6 +457,260 @@
           <w:sz w:val="28"/>
           <w:szCs w:val="28"/>
         </w:rPr>
+        <w:t>Remote Web Developer</w:t>
+      </w:r>
+      <w:r>
+        <w:rPr>
+          <w:rFonts w:ascii="Calibri" w:eastAsia="Times New Roman" w:hAnsi="Calibri" w:cs="Calibri"/>
+          <w:sz w:val="28"/>
+          <w:szCs w:val="28"/>
+        </w:rPr>
+        <w:br/>
+        <w:t>Auto Media Marketing Agency | Giza, Egypt | Oct 202</w:t>
+      </w:r>
+      <w:r>
+        <w:rPr>
+          <w:rFonts w:ascii="Calibri" w:eastAsia="Times New Roman" w:hAnsi="Calibri" w:cs="Calibri"/>
+          <w:sz w:val="28"/>
+          <w:szCs w:val="28"/>
+        </w:rPr>
+        <w:t>4</w:t>
+      </w:r>
+      <w:r>
+        <w:rPr>
+          <w:rFonts w:ascii="Calibri" w:eastAsia="Times New Roman" w:hAnsi="Calibri" w:cs="Calibri"/>
+          <w:sz w:val="28"/>
+          <w:szCs w:val="28"/>
+        </w:rPr>
+        <w:t xml:space="preserve"> – Present</w:t>
+      </w:r>
+    </w:p>
+    <w:p>
+      <w:pPr>
+        <w:pStyle w:val="ListParagraph"/>
+        <w:spacing w:before="100" w:beforeAutospacing="1" w:after="100" w:afterAutospacing="1" w:line="276" w:lineRule="auto"/>
+        <w:rPr>
+          <w:rFonts w:ascii="Calibri" w:eastAsia="Times New Roman" w:hAnsi="Calibri" w:cs="Calibri"/>
+          <w:sz w:val="28"/>
+          <w:szCs w:val="28"/>
+        </w:rPr>
+      </w:pPr>
+    </w:p>
+    <w:p>
+      <w:pPr>
+        <w:pStyle w:val="ListParagraph"/>
+        <w:spacing w:before="100" w:beforeAutospacing="1" w:after="100" w:afterAutospacing="1" w:line="276" w:lineRule="auto"/>
+        <w:rPr>
+          <w:rFonts w:eastAsia="Times New Roman" w:cstheme="minorHAnsi"/>
+          <w:sz w:val="28"/>
+          <w:szCs w:val="28"/>
+        </w:rPr>
+      </w:pPr>
+      <w:r>
+        <w:rPr>
+          <w:rFonts w:eastAsia="Times New Roman" w:cstheme="minorHAnsi"/>
+          <w:sz w:val="28"/>
+          <w:szCs w:val="28"/>
+        </w:rPr>
+        <w:t xml:space="preserve">1 - </w:t>
+      </w:r>
+      <w:r>
+        <w:rPr>
+          <w:rFonts w:cstheme="minorHAnsi"/>
+          <w:sz w:val="28"/>
+          <w:szCs w:val="28"/>
+        </w:rPr>
+        <w:t>Designed and developed user-friendly, responsive web solutions tailored to client needs using WordPress</w:t>
+      </w:r>
+      <w:r>
+        <w:rPr>
+          <w:rFonts w:eastAsia="Times New Roman" w:cstheme="minorHAnsi"/>
+          <w:sz w:val="28"/>
+          <w:szCs w:val="28"/>
+        </w:rPr>
+        <w:t>.</w:t>
+      </w:r>
+    </w:p>
+    <w:p>
+      <w:pPr>
+        <w:pStyle w:val="ListParagraph"/>
+        <w:spacing w:before="100" w:beforeAutospacing="1" w:after="100" w:afterAutospacing="1" w:line="276" w:lineRule="auto"/>
+        <w:rPr>
+          <w:rFonts w:eastAsia="Times New Roman" w:cstheme="minorHAnsi"/>
+          <w:sz w:val="28"/>
+          <w:szCs w:val="28"/>
+        </w:rPr>
+      </w:pPr>
+    </w:p>
+    <w:p>
+      <w:pPr>
+        <w:pStyle w:val="ListParagraph"/>
+        <w:spacing w:before="100" w:beforeAutospacing="1" w:after="100" w:afterAutospacing="1" w:line="276" w:lineRule="auto"/>
+        <w:rPr>
+          <w:rFonts w:eastAsia="Times New Roman" w:cstheme="minorHAnsi"/>
+          <w:sz w:val="28"/>
+          <w:szCs w:val="28"/>
+        </w:rPr>
+      </w:pPr>
+      <w:r>
+        <w:rPr>
+          <w:rFonts w:eastAsia="Times New Roman" w:cstheme="minorHAnsi"/>
+          <w:sz w:val="28"/>
+          <w:szCs w:val="28"/>
+        </w:rPr>
+        <w:t xml:space="preserve">2 - </w:t>
+      </w:r>
+      <w:r>
+        <w:rPr>
+          <w:rFonts w:cstheme="minorHAnsi"/>
+          <w:sz w:val="28"/>
+          <w:szCs w:val="28"/>
+        </w:rPr>
+        <w:t>Implemented new features and plugins to enhance functionality across multiple website</w:t>
+      </w:r>
+      <w:r>
+        <w:rPr>
+          <w:rFonts w:cstheme="minorHAnsi"/>
+          <w:sz w:val="28"/>
+          <w:szCs w:val="28"/>
+        </w:rPr>
+        <w:t>s</w:t>
+      </w:r>
+      <w:r>
+        <w:rPr>
+          <w:rFonts w:eastAsia="Times New Roman" w:cstheme="minorHAnsi"/>
+          <w:sz w:val="28"/>
+          <w:szCs w:val="28"/>
+        </w:rPr>
+        <w:t>.</w:t>
+      </w:r>
+    </w:p>
+    <w:p>
+      <w:pPr>
+        <w:pStyle w:val="ListParagraph"/>
+        <w:spacing w:before="100" w:beforeAutospacing="1" w:after="100" w:afterAutospacing="1" w:line="276" w:lineRule="auto"/>
+        <w:rPr>
+          <w:rFonts w:eastAsia="Times New Roman" w:cstheme="minorHAnsi"/>
+          <w:sz w:val="28"/>
+          <w:szCs w:val="28"/>
+        </w:rPr>
+      </w:pPr>
+    </w:p>
+    <w:p>
+      <w:pPr>
+        <w:pStyle w:val="ListParagraph"/>
+        <w:spacing w:before="100" w:beforeAutospacing="1" w:after="100" w:afterAutospacing="1" w:line="276" w:lineRule="auto"/>
+        <w:rPr>
+          <w:rFonts w:eastAsia="Times New Roman" w:cstheme="minorHAnsi"/>
+          <w:sz w:val="28"/>
+          <w:szCs w:val="28"/>
+        </w:rPr>
+      </w:pPr>
+      <w:r>
+        <w:rPr>
+          <w:rFonts w:eastAsia="Times New Roman" w:cstheme="minorHAnsi"/>
+          <w:sz w:val="28"/>
+          <w:szCs w:val="28"/>
+        </w:rPr>
+        <w:t xml:space="preserve">3 - </w:t>
+      </w:r>
+      <w:r>
+        <w:rPr>
+          <w:rFonts w:cstheme="minorHAnsi"/>
+          <w:sz w:val="28"/>
+          <w:szCs w:val="28"/>
+        </w:rPr>
+        <w:t>Optimized websites for SEO, resulting in improved rankings and visibility</w:t>
+      </w:r>
+      <w:r>
+        <w:rPr>
+          <w:rFonts w:eastAsia="Times New Roman" w:cstheme="minorHAnsi"/>
+          <w:sz w:val="28"/>
+          <w:szCs w:val="28"/>
+        </w:rPr>
+        <w:t>.</w:t>
+      </w:r>
+    </w:p>
+    <w:p>
+      <w:pPr>
+        <w:pStyle w:val="ListParagraph"/>
+        <w:spacing w:before="100" w:beforeAutospacing="1" w:after="100" w:afterAutospacing="1" w:line="276" w:lineRule="auto"/>
+        <w:rPr>
+          <w:rFonts w:eastAsia="Times New Roman" w:cstheme="minorHAnsi"/>
+          <w:sz w:val="28"/>
+          <w:szCs w:val="28"/>
+        </w:rPr>
+      </w:pPr>
+    </w:p>
+    <w:p>
+      <w:pPr>
+        <w:pStyle w:val="ListParagraph"/>
+        <w:spacing w:before="100" w:beforeAutospacing="1" w:after="100" w:afterAutospacing="1" w:line="276" w:lineRule="auto"/>
+        <w:rPr>
+          <w:rFonts w:eastAsia="Times New Roman" w:cstheme="minorHAnsi"/>
+          <w:sz w:val="28"/>
+          <w:szCs w:val="28"/>
+          <w:rtl/>
+        </w:rPr>
+      </w:pPr>
+      <w:r>
+        <w:rPr>
+          <w:rFonts w:eastAsia="Times New Roman" w:cstheme="minorHAnsi"/>
+          <w:sz w:val="28"/>
+          <w:szCs w:val="28"/>
+        </w:rPr>
+        <w:t xml:space="preserve">4 - </w:t>
+      </w:r>
+      <w:r>
+        <w:rPr>
+          <w:rFonts w:cstheme="minorHAnsi"/>
+          <w:sz w:val="28"/>
+          <w:szCs w:val="28"/>
+        </w:rPr>
+        <w:t>Analyzed website performance metrics and applied improvements for speed and reliability</w:t>
+      </w:r>
+      <w:r>
+        <w:rPr>
+          <w:rFonts w:eastAsia="Times New Roman" w:cstheme="minorHAnsi"/>
+          <w:sz w:val="28"/>
+          <w:szCs w:val="28"/>
+        </w:rPr>
+        <w:t>.</w:t>
+      </w:r>
+    </w:p>
+    <w:p>
+      <w:pPr>
+        <w:pStyle w:val="ListParagraph"/>
+        <w:spacing w:before="100" w:beforeAutospacing="1" w:after="100" w:afterAutospacing="1" w:line="276" w:lineRule="auto"/>
+        <w:rPr>
+          <w:rFonts w:ascii="Calibri" w:eastAsia="Times New Roman" w:hAnsi="Calibri" w:cs="Calibri"/>
+          <w:sz w:val="28"/>
+          <w:szCs w:val="28"/>
+        </w:rPr>
+      </w:pPr>
+    </w:p>
+    <w:p>
+      <w:pPr>
+        <w:pStyle w:val="ListParagraph"/>
+        <w:numPr>
+          <w:ilvl w:val="0"/>
+          <w:numId w:val="12"/>
+        </w:numPr>
+        <w:spacing w:before="100" w:beforeAutospacing="1" w:after="100" w:afterAutospacing="1" w:line="276" w:lineRule="auto"/>
+        <w:rPr>
+          <w:rFonts w:ascii="Calibri" w:eastAsia="Times New Roman" w:hAnsi="Calibri" w:cs="Calibri"/>
+          <w:sz w:val="28"/>
+          <w:szCs w:val="28"/>
+        </w:rPr>
+      </w:pPr>
+      <w:r>
+        <w:rPr>
+          <w:rFonts w:ascii="Calibri" w:eastAsia="Times New Roman" w:hAnsi="Calibri" w:cs="Calibri"/>
+          <w:b/>
+          <w:bCs/>
+          <w:sz w:val="28"/>
+          <w:szCs w:val="28"/>
+        </w:rPr>
         <w:t>Team Leader – Web Developer</w:t>
       </w:r>
       <w:r>
@@ -554,7 +720,7 @@
           <w:szCs w:val="28"/>
         </w:rPr>
         <w:br/>
-        <w:t>Vision 22 Marketing Agency | Cairo, Egypt | Mar 2024 – Present</w:t>
+        <w:t>Vision 22 Marketing Agency | Cairo, Egypt | Mar 2024 – Jun 2026</w:t>
       </w:r>
     </w:p>
     <w:p>
@@ -2013,7 +2179,7 @@
           <w:sz w:val="28"/>
           <w:szCs w:val="28"/>
         </w:rPr>
-        <w:t>Postponed</w:t>
+        <w:t>Completed</w:t>
       </w:r>
     </w:p>
     <w:p>

</xml_diff>